<commit_message>
docs: actualizar documento TAP — alcance reducido a distribución (sin compras, producción, inventario, precios, cobros)
</commit_message>
<xml_diff>
--- a/docs/SIADLP_Documento.docx
+++ b/docs/SIADLP_Documento.docx
@@ -959,7 +959,7 @@
           <w:color w:val="000000"/>
           <w:sz w:val="24"/>
         </w:rPr>
-        <w:t xml:space="preserve">     3.2 Sprint 2 — Módulo de Pedidos y Compras ..................... 55</w:t>
+        <w:t xml:space="preserve">     3.2 Sprint 2 — Módulo de Pedidos ..................... 55</w:t>
       </w:r>
     </w:p>
     <w:p>
@@ -974,7 +974,7 @@
           <w:color w:val="000000"/>
           <w:sz w:val="24"/>
         </w:rPr>
-        <w:t xml:space="preserve">     3.3 Sprint 3 — Módulo de Producción e Inventario Dual .......... 58</w:t>
+        <w:t xml:space="preserve">     3.3 Sprint 3 — Módulo de Despacho y Distribución .......... 58</w:t>
       </w:r>
     </w:p>
     <w:p>
@@ -989,7 +989,7 @@
           <w:color w:val="000000"/>
           <w:sz w:val="24"/>
         </w:rPr>
-        <w:t xml:space="preserve">     3.4 Sprint 4 — Módulo de Despacho y Distribución ............... 60</w:t>
+        <w:t xml:space="preserve">     3.4 Sprint 4 — Dashboard, Reportes y Auditoría ............... 60</w:t>
       </w:r>
     </w:p>
     <w:p>
@@ -1004,7 +1004,6 @@
           <w:color w:val="000000"/>
           <w:sz w:val="24"/>
         </w:rPr>
-        <w:t xml:space="preserve">     3.5 Sprint 5 — Dashboard, Reportes y Auditoría ................. 62</w:t>
       </w:r>
     </w:p>
     <w:p>
@@ -1505,7 +1504,6 @@
           <w:color w:val="000000"/>
           <w:sz w:val="24"/>
         </w:rPr>
-        <w:t>Tabla 15. Historias de Usuario — Épica 4: Gestión de Compras ............. 42</w:t>
       </w:r>
     </w:p>
     <w:p>
@@ -1520,7 +1518,6 @@
           <w:color w:val="000000"/>
           <w:sz w:val="24"/>
         </w:rPr>
-        <w:t>Tabla 16. Historias de Usuario — Épica 5: Gestión de Producción .......... 43</w:t>
       </w:r>
     </w:p>
     <w:p>
@@ -1535,7 +1532,6 @@
           <w:color w:val="000000"/>
           <w:sz w:val="24"/>
         </w:rPr>
-        <w:t>Tabla 17. Historias de Usuario — Épica 6: Control de Inventario Dual ..... 44</w:t>
       </w:r>
     </w:p>
     <w:p>
@@ -1550,7 +1546,7 @@
           <w:color w:val="000000"/>
           <w:sz w:val="24"/>
         </w:rPr>
-        <w:t>Tabla 18. Historias de Usuario — Épica 7: Despacho y Distribución ........ 45</w:t>
+        <w:t>Tabla 18. Historias de Usuario — Épica 4: Despacho y Distribución ........ 45</w:t>
       </w:r>
     </w:p>
     <w:p>
@@ -1841,7 +1837,6 @@
           <w:color w:val="000000"/>
           <w:sz w:val="24"/>
         </w:rPr>
-        <w:t>Figura 14. Registro de lote de producción con rendimiento y merma ........ 59</w:t>
       </w:r>
     </w:p>
     <w:p>
@@ -1856,7 +1851,6 @@
           <w:color w:val="000000"/>
           <w:sz w:val="24"/>
         </w:rPr>
-        <w:t>Figura 15. Inventario de producto terminado con alertas de stock ......... 59</w:t>
       </w:r>
     </w:p>
     <w:p>
@@ -3895,7 +3889,6 @@
           <w:color w:val="000000"/>
           <w:sz w:val="24"/>
         </w:rPr>
-        <w:t>Problema 2: Descontrol del inventario de materia prima y producto terminado</w:t>
       </w:r>
     </w:p>
     <w:p>
@@ -3910,7 +3903,6 @@
           <w:color w:val="000000"/>
           <w:sz w:val="24"/>
         </w:rPr>
-        <w:t>La empresa manejaba dos tipos de inventario: papa entera (materia prima) y papa procesada en sus diversas presentaciones (producto terminado). Ambos inventarios se registraban en hojas de cálculo de Excel que no siempre estaban actualizadas, especialmente ante compras urgentes o producciones extraordinarias. Esto generaba sobrestock o desabastecimiento sin que la gerencia tuviera visibilidad en tiempo real.</w:t>
       </w:r>
     </w:p>
     <w:p>
@@ -3925,7 +3917,6 @@
           <w:color w:val="000000"/>
           <w:sz w:val="24"/>
         </w:rPr>
-        <w:t>Problema 3: Pérdida de trazabilidad en la producción</w:t>
       </w:r>
     </w:p>
     <w:p>
@@ -3940,7 +3931,6 @@
           <w:color w:val="000000"/>
           <w:sz w:val="24"/>
         </w:rPr>
-        <w:t>El proceso productivo —pelado, cortado y embolsado de papa— no contaba con registros formales. No existía un control sistemático del rendimiento por lote (cuántos kilos de producto terminado se obtenían por cada 100 kg de materia prima ingresada) ni de la merma (papa no aprovechable). Esto impedía calcular el costo real de producción por SKU y tomar decisiones de precios basadas en datos reales.</w:t>
       </w:r>
     </w:p>
     <w:p>
@@ -3955,7 +3945,6 @@
           <w:color w:val="000000"/>
           <w:sz w:val="24"/>
         </w:rPr>
-        <w:t>Problema 4: Planificación de producción desvinculada de los pedidos</w:t>
       </w:r>
     </w:p>
     <w:p>
@@ -3970,7 +3959,6 @@
           <w:color w:val="000000"/>
           <w:sz w:val="24"/>
         </w:rPr>
-        <w:t>El área de producción planificaba su trabajo del día siguiente basándose en estimaciones históricas y criterio del jefe de planta, sin acceso a información consolidada de los pedidos confirmados para el día. Esto generaba sobreproducción en algunos SKUs y desabastecimiento en otros, con el consecuente desperdicio de materia prima o incumplimiento de pedidos.</w:t>
       </w:r>
     </w:p>
     <w:p>
@@ -3985,7 +3973,7 @@
           <w:color w:val="000000"/>
           <w:sz w:val="24"/>
         </w:rPr>
-        <w:t>Problema 5: Despacho ineficiente y sin registro formal</w:t>
+        <w:t>Problema 2: Despacho ineficiente y sin registro formal</w:t>
       </w:r>
     </w:p>
     <w:p>
@@ -4640,7 +4628,7 @@
           <w:rFonts w:ascii="Times New Roman" w:hAnsi="Times New Roman"/>
           <w:sz w:val="24"/>
         </w:rPr>
-        <w:t>Implementar un módulo de gestión de pedidos que permita el registro, seguimiento y control del ciclo de vida de los pedidos de las 45 pollerías clientes, con cálculo automático del precio final según el precio base del SKU, la tarifa por ruta (ubigeo de entrega) y el tipo de cliente (mayorista o minorista).</w:t>
+        <w:t>Implementar un módulo de gestión de pedidos que permita el registro, seguimiento y control del ciclo de vida de los pedidos de las 45 pollerías clientes, con el precio base del SKU, la tarifa por ruta (ubigeo de entrega) y el tipo de cliente (mayorista o minorista).</w:t>
       </w:r>
     </w:p>
     <w:p>
@@ -4652,7 +4640,6 @@
           <w:rFonts w:ascii="Times New Roman" w:hAnsi="Times New Roman"/>
           <w:sz w:val="24"/>
         </w:rPr>
-        <w:t>Desarrollar un módulo de compras que permita el registro de órdenes de compra de materia prima, el seguimiento del estado de cada orden y la actualización automática del inventario de materia prima al confirmar la recepción de mercadería.</w:t>
       </w:r>
     </w:p>
     <w:p>
@@ -4664,7 +4651,6 @@
           <w:rFonts w:ascii="Times New Roman" w:hAnsi="Times New Roman"/>
           <w:sz w:val="24"/>
         </w:rPr>
-        <w:t>Construir un módulo de producción que registre los lotes de procesamiento (pelado, cortado y embolsado de papa), calculando automáticamente el rendimiento productivo, la merma real y el costo de producción por kilogramo de producto terminado, vinculando cada lote a las salidas de inventario de materia prima y a las entradas de inventario de producto terminado.</w:t>
       </w:r>
     </w:p>
     <w:p>
@@ -4676,7 +4662,6 @@
           <w:rFonts w:ascii="Times New Roman" w:hAnsi="Times New Roman"/>
           <w:sz w:val="24"/>
         </w:rPr>
-        <w:t>Implementar un módulo de control de inventario dual con gestión independiente para materia prima (papa entera) y producto terminado (papa procesada en sus presentaciones), con movimientos automáticos generados por las transacciones de compra, producción y despacho, y con alertas configurables de stock mínimo.</w:t>
       </w:r>
     </w:p>
     <w:p>
@@ -4730,7 +4715,7 @@
           <w:color w:val="000000"/>
           <w:sz w:val="24"/>
         </w:rPr>
-        <w:t>El sistema SIADLP abarca siete épicas funcionales que cubren el ciclo operativo completo de La Cosecha S.A.C.:</w:t>
+        <w:t>El sistema SIADLP abarca cuatro épicas funcionales centradas en el proceso de distribución de La Cosecha S.A.C.:</w:t>
       </w:r>
     </w:p>
     <w:p>
@@ -4760,7 +4745,7 @@
           <w:color w:val="000000"/>
           <w:sz w:val="24"/>
         </w:rPr>
-        <w:t>Administración de usuarios del sistema con perfiles de rol diferenciados: Gerente General, Administrador, Vendedor, Comprador, Jefe de Producción, Operario de Almacén y Chofer/Repartidor. Implementación de RBAC dinámico con permisos granulares a nivel de módulo y acción (crear, leer, actualizar, eliminar). Gestión de contraseñas y sesiones con autenticación JWT.</w:t>
+        <w:t>Administración de usuarios del sistema con perfiles de rol diferenciados: Gerente General, Administrador, Vendedor, Jefe de Despacho y Chofer/Repartidor. Implementación de RBAC dinámico con permisos granulares a nivel de módulo y acción (crear, leer, actualizar, eliminar). Gestión de contraseñas y sesiones con autenticación JWT.</w:t>
       </w:r>
     </w:p>
     <w:p>
@@ -4790,7 +4775,7 @@
           <w:color w:val="000000"/>
           <w:sz w:val="24"/>
         </w:rPr>
-        <w:t>Mantenimiento de catálogos base del sistema: clientes (pollerías), proveedores, productos/SKUs con precio base, categorías de productos, unidades de medida, vehículos de transporte, choferes, rutas con sus tarifas por ubigeo, y tabla de tipos de cliente con sus factores de precio.</w:t>
+        <w:t>Mantenimiento de catálogos base del sistema: clientes (pollerías), productos/SKUs con unidad de medida, vehículos de transporte, choferes, rutas con sus tarifas por ubigeo, y tabla de tipos de cliente con sus factores de precio.</w:t>
       </w:r>
     </w:p>
     <w:p>
@@ -4835,7 +4820,6 @@
           <w:color w:val="000000"/>
           <w:sz w:val="24"/>
         </w:rPr>
-        <w:t>Épica 4 — Gestión de Compras</w:t>
       </w:r>
     </w:p>
     <w:p>
@@ -4850,7 +4834,6 @@
           <w:color w:val="000000"/>
           <w:sz w:val="24"/>
         </w:rPr>
-        <w:t>Registro de órdenes de compra de materia prima a proveedores: emisión de la orden con detalle de ítems y cantidades requeridas, seguimiento del estado de la orden (Emitida → Confirmada por Proveedor → Recibida Parcialmente → Recibida Completa), registro de la recepción con las cantidades efectivamente recibidas, y actualización automática del inventario de materia prima al confirmar la recepción.</w:t>
       </w:r>
     </w:p>
     <w:p>
@@ -4865,7 +4848,6 @@
           <w:color w:val="000000"/>
           <w:sz w:val="24"/>
         </w:rPr>
-        <w:t>Épica 5 — Gestión de Producción</w:t>
       </w:r>
     </w:p>
     <w:p>
@@ -4880,7 +4862,6 @@
           <w:color w:val="000000"/>
           <w:sz w:val="24"/>
         </w:rPr>
-        <w:t>Registro de programas de producción diaria vinculados a los pedidos confirmados para el día, y registro de lotes de producción ejecutados: materia prima utilizada (tipo y cantidad en kg), productos obtenidos (SKU y cantidad en kg o unidades), cálculo automático del rendimiento (% de aprovechamiento), merma absoluta y porcentual, y costo real de producción por unidad de producto terminado. Generación automática de movimientos de salida en inventario de materia prima y de entrada en inventario de producto terminado.</w:t>
       </w:r>
     </w:p>
     <w:p>
@@ -4895,7 +4876,6 @@
           <w:color w:val="000000"/>
           <w:sz w:val="24"/>
         </w:rPr>
-        <w:t>Épica 6 — Control de Inventario Dual</w:t>
       </w:r>
     </w:p>
     <w:p>
@@ -4910,7 +4890,6 @@
           <w:color w:val="000000"/>
           <w:sz w:val="24"/>
         </w:rPr>
-        <w:t>Gestión de inventario en dos niveles independientes: (a) Inventario de Materia Prima: papa entera por variedad y proveedor, con seguimiento de entradas por compra, salidas por producción y saldo actual. (b) Inventario de Producto Terminado: cada SKU con seguimiento de entradas por producción, salidas por despacho y saldo actual. Ambos inventarios con alertas de stock mínimo configurables, registro de ajustes de inventario con justificación, y acceso a kardex por ítem.</w:t>
       </w:r>
     </w:p>
     <w:p>
@@ -4925,7 +4904,7 @@
           <w:color w:val="000000"/>
           <w:sz w:val="24"/>
         </w:rPr>
-        <w:t>Épica 7 — Gestión de Despacho y Distribución</w:t>
+        <w:t>Épica 4 — Gestión de Despacho y Distribución</w:t>
       </w:r>
     </w:p>
     <w:p>
@@ -4940,7 +4919,7 @@
           <w:color w:val="000000"/>
           <w:sz w:val="24"/>
         </w:rPr>
-        <w:t>Armado de carga: agrupación de pedidos listos para despacho por ruta y asignación a unidades de transporte. Asignación de chofer a cada unidad. Generación de hojas de ruta con detalle de paradas, pedidos y montos a cobrar. Generación de Guía de Remisión Electrónica (GRE) en formato requerido. Registro de entregas realizadas por el chofer en campo: confirmación de entrega, monto cobrado, observaciones. Registro de devoluciones o novedades en ruta.</w:t>
+        <w:t>Armado de carga: agrupación de pedidos listos para despacho por ruta y asignación a unidades de transporte. Asignación de chofer a cada unidad. Generación de hojas de ruta con detalle de paradas, pedidos y montos a cobrar. Confirmación del despacho en formato requerido. Registro de entregas realizadas por el chofer en campo: confirmación de entrega, monto cobrado, observaciones. Registro de devoluciones o novedades en ruta.</w:t>
       </w:r>
     </w:p>
     <w:p>
@@ -10363,7 +10342,7 @@
           <w:rFonts w:ascii="Times New Roman" w:hAnsi="Times New Roman"/>
           <w:sz w:val="24"/>
         </w:rPr>
-        <w:t xml:space="preserve"> El sistema debe permitir el registro y mantenimiento del catálogo de productos (SKUs) con precio base, unidad de medida y categoría.</w:t>
+        <w:t xml:space="preserve"> El sistema debe permitir el registro y mantenimiento del catálogo de productos (SKUs) con unidad de medida.</w:t>
       </w:r>
     </w:p>
     <w:p>
@@ -10451,14 +10430,13 @@
           <w:b/>
           <w:sz w:val="24"/>
         </w:rPr>
-        <w:t>RF-12:</w:t>
       </w:r>
       <w:r>
         <w:rPr>
           <w:rFonts w:ascii="Times New Roman" w:hAnsi="Times New Roman"/>
           <w:sz w:val="24"/>
         </w:rPr>
-        <w:t xml:space="preserve"> El sistema debe calcular automáticamente el precio de venta de cada línea de pedido: precio base SKU + tarifa ruta del cliente + factor de tipo de cliente.</w:t>
+        <w:t>RF-12: El sistema debe permitir agregar líneas de detalle al pedido con producto y cantidad en kilogramos.</w:t>
       </w:r>
     </w:p>
     <w:p>
@@ -10533,7 +10511,6 @@
           <w:color w:val="000000"/>
           <w:sz w:val="24"/>
         </w:rPr>
-        <w:t>Módulo 4 — Compras</w:t>
       </w:r>
     </w:p>
     <w:p>
@@ -10546,14 +10523,12 @@
           <w:b/>
           <w:sz w:val="24"/>
         </w:rPr>
-        <w:t>RF-16:</w:t>
       </w:r>
       <w:r>
         <w:rPr>
           <w:rFonts w:ascii="Times New Roman" w:hAnsi="Times New Roman"/>
           <w:sz w:val="24"/>
         </w:rPr>
-        <w:t xml:space="preserve"> El sistema debe permitir registrar órdenes de compra de materia prima con detalle de ítems y cantidades.</w:t>
       </w:r>
     </w:p>
     <w:p>
@@ -10566,14 +10541,12 @@
           <w:b/>
           <w:sz w:val="24"/>
         </w:rPr>
-        <w:t>RF-17:</w:t>
       </w:r>
       <w:r>
         <w:rPr>
           <w:rFonts w:ascii="Times New Roman" w:hAnsi="Times New Roman"/>
           <w:sz w:val="24"/>
         </w:rPr>
-        <w:t xml:space="preserve"> El sistema debe gestionar el estado de cada orden de compra.</w:t>
       </w:r>
     </w:p>
     <w:p>
@@ -10586,14 +10559,12 @@
           <w:b/>
           <w:sz w:val="24"/>
         </w:rPr>
-        <w:t>RF-18:</w:t>
       </w:r>
       <w:r>
         <w:rPr>
           <w:rFonts w:ascii="Times New Roman" w:hAnsi="Times New Roman"/>
           <w:sz w:val="24"/>
         </w:rPr>
-        <w:t xml:space="preserve"> El sistema debe registrar la recepción de mercadería con las cantidades efectivamente recibidas.</w:t>
       </w:r>
     </w:p>
     <w:p>
@@ -10606,14 +10577,12 @@
           <w:b/>
           <w:sz w:val="24"/>
         </w:rPr>
-        <w:t>RF-19:</w:t>
       </w:r>
       <w:r>
         <w:rPr>
           <w:rFonts w:ascii="Times New Roman" w:hAnsi="Times New Roman"/>
           <w:sz w:val="24"/>
         </w:rPr>
-        <w:t xml:space="preserve"> El sistema debe generar automáticamente un movimiento de entrada en el inventario de materia prima al confirmar la recepción.</w:t>
       </w:r>
     </w:p>
     <w:p>
@@ -10628,7 +10597,6 @@
           <w:color w:val="000000"/>
           <w:sz w:val="24"/>
         </w:rPr>
-        <w:t>Módulo 5 — Producción</w:t>
       </w:r>
     </w:p>
     <w:p>
@@ -10641,14 +10609,12 @@
           <w:b/>
           <w:sz w:val="24"/>
         </w:rPr>
-        <w:t>RF-20:</w:t>
       </w:r>
       <w:r>
         <w:rPr>
           <w:rFonts w:ascii="Times New Roman" w:hAnsi="Times New Roman"/>
           <w:sz w:val="24"/>
         </w:rPr>
-        <w:t xml:space="preserve"> El sistema debe permitir registrar programas de producción diaria vinculados a pedidos confirmados.</w:t>
       </w:r>
     </w:p>
     <w:p>
@@ -10661,14 +10627,12 @@
           <w:b/>
           <w:sz w:val="24"/>
         </w:rPr>
-        <w:t>RF-21:</w:t>
       </w:r>
       <w:r>
         <w:rPr>
           <w:rFonts w:ascii="Times New Roman" w:hAnsi="Times New Roman"/>
           <w:sz w:val="24"/>
         </w:rPr>
-        <w:t xml:space="preserve"> El sistema debe registrar lotes de producción con materia prima utilizada y productos obtenidos.</w:t>
       </w:r>
     </w:p>
     <w:p>
@@ -10681,14 +10645,12 @@
           <w:b/>
           <w:sz w:val="24"/>
         </w:rPr>
-        <w:t>RF-22:</w:t>
       </w:r>
       <w:r>
         <w:rPr>
           <w:rFonts w:ascii="Times New Roman" w:hAnsi="Times New Roman"/>
           <w:sz w:val="24"/>
         </w:rPr>
-        <w:t xml:space="preserve"> El sistema debe calcular automáticamente el rendimiento, la merma y el costo de producción por lote.</w:t>
       </w:r>
     </w:p>
     <w:p>
@@ -10701,14 +10663,12 @@
           <w:b/>
           <w:sz w:val="24"/>
         </w:rPr>
-        <w:t>RF-23:</w:t>
       </w:r>
       <w:r>
         <w:rPr>
           <w:rFonts w:ascii="Times New Roman" w:hAnsi="Times New Roman"/>
           <w:sz w:val="24"/>
         </w:rPr>
-        <w:t xml:space="preserve"> El sistema debe generar automáticamente movimientos en ambos inventarios al cerrar un lote de producción.</w:t>
       </w:r>
     </w:p>
     <w:p>
@@ -10723,7 +10683,6 @@
           <w:color w:val="000000"/>
           <w:sz w:val="24"/>
         </w:rPr>
-        <w:t>Módulo 6 — Inventario</w:t>
       </w:r>
     </w:p>
     <w:p>
@@ -10736,14 +10695,12 @@
           <w:b/>
           <w:sz w:val="24"/>
         </w:rPr>
-        <w:t>RF-24:</w:t>
       </w:r>
       <w:r>
         <w:rPr>
           <w:rFonts w:ascii="Times New Roman" w:hAnsi="Times New Roman"/>
           <w:sz w:val="24"/>
         </w:rPr>
-        <w:t xml:space="preserve"> El sistema debe gestionar el inventario de materia prima con kardex de movimientos.</w:t>
       </w:r>
     </w:p>
     <w:p>
@@ -10756,14 +10713,12 @@
           <w:b/>
           <w:sz w:val="24"/>
         </w:rPr>
-        <w:t>RF-25:</w:t>
       </w:r>
       <w:r>
         <w:rPr>
           <w:rFonts w:ascii="Times New Roman" w:hAnsi="Times New Roman"/>
           <w:sz w:val="24"/>
         </w:rPr>
-        <w:t xml:space="preserve"> El sistema debe gestionar el inventario de producto terminado con kardex de movimientos.</w:t>
       </w:r>
     </w:p>
     <w:p>
@@ -10776,14 +10731,12 @@
           <w:b/>
           <w:sz w:val="24"/>
         </w:rPr>
-        <w:t>RF-26:</w:t>
       </w:r>
       <w:r>
         <w:rPr>
           <w:rFonts w:ascii="Times New Roman" w:hAnsi="Times New Roman"/>
           <w:sz w:val="24"/>
         </w:rPr>
-        <w:t xml:space="preserve"> El sistema debe emitir alertas cuando el stock de un ítem caiga por debajo del nivel mínimo configurado.</w:t>
       </w:r>
     </w:p>
     <w:p>
@@ -10796,14 +10749,12 @@
           <w:b/>
           <w:sz w:val="24"/>
         </w:rPr>
-        <w:t>RF-27:</w:t>
       </w:r>
       <w:r>
         <w:rPr>
           <w:rFonts w:ascii="Times New Roman" w:hAnsi="Times New Roman"/>
           <w:sz w:val="24"/>
         </w:rPr>
-        <w:t xml:space="preserve"> El sistema debe permitir registrar ajustes de inventario con justificación y usuario responsable.</w:t>
       </w:r>
     </w:p>
     <w:p>
@@ -10818,7 +10769,7 @@
           <w:color w:val="000000"/>
           <w:sz w:val="24"/>
         </w:rPr>
-        <w:t>Módulo 7 — Despacho</w:t>
+        <w:t>Módulo 4 — Despacho</w:t>
       </w:r>
     </w:p>
     <w:p>
@@ -10891,14 +10842,13 @@
           <w:b/>
           <w:sz w:val="24"/>
         </w:rPr>
-        <w:t>RF-31:</w:t>
+        <w:t>RF-31: El sistema debe registrar las entregas realizadas con confirmación o novedad por pedido.</w:t>
       </w:r>
       <w:r>
         <w:rPr>
           <w:rFonts w:ascii="Times New Roman" w:hAnsi="Times New Roman"/>
           <w:sz w:val="24"/>
         </w:rPr>
-        <w:t xml:space="preserve"> El sistema debe registrar las entregas realizadas con confirmación por pedido y monto cobrado.</w:t>
       </w:r>
     </w:p>
     <w:p>
@@ -11035,7 +10985,7 @@
           <w:color w:val="000000"/>
           <w:sz w:val="24"/>
         </w:rPr>
-        <w:t>El proyecto contempla un total de 52 historias de usuario organizadas en las siete épicas del sistema. A continuación se presenta el listado completo:</w:t>
+        <w:t>El proyecto contempla historias de usuario organizadas en las épicas del sistema. A continuación se presenta el listado completo:</w:t>
       </w:r>
     </w:p>
     <w:p>
@@ -12805,7 +12755,6 @@
           <w:color w:val="000000"/>
           <w:sz w:val="24"/>
         </w:rPr>
-        <w:t>Épica 4 — Gestión de Compras</w:t>
       </w:r>
     </w:p>
     <w:tbl>
@@ -13258,7 +13207,6 @@
           <w:color w:val="000000"/>
           <w:sz w:val="24"/>
         </w:rPr>
-        <w:t>Épica 5 — Gestión de Producción</w:t>
       </w:r>
     </w:p>
     <w:tbl>
@@ -13777,7 +13725,6 @@
           <w:color w:val="000000"/>
           <w:sz w:val="24"/>
         </w:rPr>
-        <w:t>Épica 6 — Control de Inventario Dual</w:t>
       </w:r>
     </w:p>
     <w:tbl>
@@ -14362,7 +14309,7 @@
           <w:color w:val="000000"/>
           <w:sz w:val="24"/>
         </w:rPr>
-        <w:t>Épica 7 — Gestión de Despacho y Distribución</w:t>
+        <w:t>Épica 4 — Gestión de Despacho y Distribución</w:t>
       </w:r>
     </w:p>
     <w:tbl>
@@ -16217,14 +16164,12 @@
           <w:b/>
           <w:sz w:val="24"/>
         </w:rPr>
-        <w:t xml:space="preserve">Compras: </w:t>
       </w:r>
       <w:r>
         <w:rPr>
           <w:rFonts w:ascii="Times New Roman" w:hAnsi="Times New Roman"/>
           <w:sz w:val="24"/>
         </w:rPr>
-        <w:t>`PurchaseOrder`, `PurchaseOrderLine`, `PurchaseReceipt`, `PurchaseReceiptLine`</w:t>
       </w:r>
     </w:p>
     <w:p>
@@ -16237,14 +16182,12 @@
           <w:b/>
           <w:sz w:val="24"/>
         </w:rPr>
-        <w:t xml:space="preserve">Producción: </w:t>
       </w:r>
       <w:r>
         <w:rPr>
           <w:rFonts w:ascii="Times New Roman" w:hAnsi="Times New Roman"/>
           <w:sz w:val="24"/>
         </w:rPr>
-        <w:t>`ProductionPlan`, `ProductionBatch`, `BatchInput`, `BatchOutput`</w:t>
       </w:r>
     </w:p>
     <w:p>
@@ -16257,14 +16200,12 @@
           <w:b/>
           <w:sz w:val="24"/>
         </w:rPr>
-        <w:t xml:space="preserve">Inventario: </w:t>
       </w:r>
       <w:r>
         <w:rPr>
           <w:rFonts w:ascii="Times New Roman" w:hAnsi="Times New Roman"/>
           <w:sz w:val="24"/>
         </w:rPr>
-        <w:t>`RawMaterialStock`, `RawMaterialMovement`, `FinishedGoodStock`, `FinishedGoodMovement`</w:t>
       </w:r>
     </w:p>
     <w:p>
@@ -16284,7 +16225,7 @@
           <w:rFonts w:ascii="Times New Roman" w:hAnsi="Times New Roman"/>
           <w:sz w:val="24"/>
         </w:rPr>
-        <w:t>`DispatchLoad`, `DispatchLoadLine`, `Delivery`, `DeliveryReturn`, `RouteSheet`</w:t>
+        <w:t>`HojaCarga`, `Pedido` (relación), `Entrega`</w:t>
       </w:r>
     </w:p>
     <w:p>
@@ -16398,7 +16339,7 @@
           <w:rFonts w:ascii="Times New Roman" w:hAnsi="Times New Roman"/>
           <w:sz w:val="24"/>
         </w:rPr>
-        <w:t>Capa de Presentación (Frontend): Aplicación web construida con Next.js 14 (App Router) y React 18. Desplegada como aplicación estática optimizada en Railway.app. Se comunica con el backend exclusivamente a través de la API REST mediante HTTPS. Utiliza Tailwind CSS para estilos responsivos.</w:t>
+        <w:t>Capa de Presentación (Frontend): Aplicación web construida con Next.js 16 (App Router) y React 19. Desplegada como aplicación estática optimizada en Railway.app. Se comunica con el backend exclusivamente a través de la API REST mediante HTTPS. Utiliza Tailwind CSS para estilos responsivos.</w:t>
       </w:r>
     </w:p>
     <w:p>
@@ -16410,7 +16351,7 @@
           <w:rFonts w:ascii="Times New Roman" w:hAnsi="Times New Roman"/>
           <w:sz w:val="24"/>
         </w:rPr>
-        <w:t>Capa de Lógica de Negocio (Backend): API REST construida con NestJS v10 en Node.js. Organizada en módulos independientes que corresponden a cada épica del sistema. Implementa autenticación JWT con guards de autorización RBAC. Se despliega como servicio web en Railway.app.</w:t>
+        <w:t>Capa de Lógica de Negocio (Backend): API REST construida con NestJS v11 en Node.js. Organizada en módulos independientes que corresponden a cada épica del sistema. Implementa autenticación JWT con guards de autorización RBAC. Se despliega como servicio web en Railway.app.</w:t>
       </w:r>
     </w:p>
     <w:p>
@@ -16422,7 +16363,7 @@
           <w:rFonts w:ascii="Times New Roman" w:hAnsi="Times New Roman"/>
           <w:sz w:val="24"/>
         </w:rPr>
-        <w:t>Capa de Datos (Base de Datos): PostgreSQL 15 gestionada con Prisma ORM. El esquema se gestiona mediante migraciones versionadas. Se despliega como servicio de base de datos en Railway.app con backups automáticos diarios.</w:t>
+        <w:t>Capa de Datos (Base de Datos): PostgreSQL 15 gestionada con Prisma ORM. El esquema se gestiona mediante migraciones versionadas. Se despliega como servicio containerizado con Docker Compose.</w:t>
       </w:r>
     </w:p>
     <w:p>
@@ -16451,29 +16392,6 @@
           <w:color w:val="1E1E1E"/>
           <w:sz w:val="16"/>
         </w:rPr>
-        <w:t>src/</w:t>
-        <w:br/>
-        <w:t xml:space="preserve">  auth/           # Autenticación JWT y guards de autorización</w:t>
-        <w:br/>
-        <w:t xml:space="preserve">  users/          # Gestión de usuarios y RBAC</w:t>
-        <w:br/>
-        <w:t xml:space="preserve">  catalogs/       # Módulos de catálogos (clientes, proveedores, productos, rutas)</w:t>
-        <w:br/>
-        <w:t xml:space="preserve">  orders/         # Módulo de pedidos</w:t>
-        <w:br/>
-        <w:t xml:space="preserve">  purchases/      # Módulo de compras</w:t>
-        <w:br/>
-        <w:t xml:space="preserve">  production/     # Módulo de producción</w:t>
-        <w:br/>
-        <w:t xml:space="preserve">  inventory/      # Módulo de inventario dual</w:t>
-        <w:br/>
-        <w:t xml:space="preserve">  dispatch/       # Módulo de despacho y distribución</w:t>
-        <w:br/>
-        <w:t xml:space="preserve">  reports/        # Módulo de reportes y dashboard</w:t>
-        <w:br/>
-        <w:t xml:space="preserve">  common/         # Utilidades, decoradores, filtros de excepciones</w:t>
-        <w:br/>
-        <w:t xml:space="preserve">  prisma/         # Servicio Prisma compartido</w:t>
       </w:r>
     </w:p>
     <w:p>
@@ -16761,7 +16679,7 @@
           <w:color w:val="000000"/>
           <w:sz w:val="26"/>
         </w:rPr>
-        <w:t>3.2 Sprint 2 — Módulo de Pedidos y Compras</w:t>
+        <w:t>3.2 Sprint 2 — Módulo de Pedidos</w:t>
       </w:r>
     </w:p>
     <w:p>
@@ -16791,7 +16709,7 @@
           <w:color w:val="000000"/>
           <w:sz w:val="24"/>
         </w:rPr>
-        <w:t>El Sprint 2 implementó los módulos de mayor impacto inmediato para el área comercial de la empresa: la gestión integral de pedidos con cálculo automático de precios y la gestión de compras de materia prima.</w:t>
+        <w:t>El Sprint 2 implementó los módulos de mayor impacto inmediato para el área comercial de la empresa: la gestión integral del ciclo de vida de un pedido desde su registro hasta su confirmación para despacho.</w:t>
       </w:r>
     </w:p>
     <w:p>
@@ -16806,7 +16724,6 @@
           <w:color w:val="000000"/>
           <w:sz w:val="24"/>
         </w:rPr>
-        <w:t>3.2.2 Lógica de Negocio: Cálculo de Precio de Pedido</w:t>
       </w:r>
     </w:p>
     <w:p>
@@ -16821,7 +16738,6 @@
           <w:color w:val="000000"/>
           <w:sz w:val="24"/>
         </w:rPr>
-        <w:t>La regla de negocio central del módulo de pedidos es el cálculo del precio de venta unitario de cada línea de pedido. La fórmula implementada es:</w:t>
       </w:r>
     </w:p>
     <w:p>
@@ -16835,7 +16751,6 @@
           <w:color w:val="1E1E1E"/>
           <w:sz w:val="16"/>
         </w:rPr>
-        <w:t>Precio Unitario Final = Precio Base SKU + Tarifa Ruta (ubigeo cliente) × Factor Tipo Cliente</w:t>
       </w:r>
     </w:p>
     <w:p>
@@ -16862,7 +16777,6 @@
           <w:rFonts w:ascii="Times New Roman" w:hAnsi="Times New Roman"/>
           <w:sz w:val="24"/>
         </w:rPr>
-        <w:t>Precio Base SKU: precio de lista del producto en su presentación específica.</w:t>
       </w:r>
     </w:p>
     <w:p>
@@ -16874,7 +16788,6 @@
           <w:rFonts w:ascii="Times New Roman" w:hAnsi="Times New Roman"/>
           <w:sz w:val="24"/>
         </w:rPr>
-        <w:t>Tarifa Ruta: tarifa de distribución adicional asociada al ubigeo del punto de entrega del cliente.</w:t>
       </w:r>
     </w:p>
     <w:p>
@@ -16886,7 +16799,6 @@
           <w:rFonts w:ascii="Times New Roman" w:hAnsi="Times New Roman"/>
           <w:sz w:val="24"/>
         </w:rPr>
-        <w:t>Factor Tipo Cliente: multiplicador configurado por tipo de cliente; los clientes mayoristas pueden tener descuento sobre el precio base, mientras que los minoristas pagan el precio estándar.</w:t>
       </w:r>
     </w:p>
     <w:p>
@@ -16901,7 +16813,6 @@
           <w:color w:val="000000"/>
           <w:sz w:val="24"/>
         </w:rPr>
-        <w:t>Esta lógica fue implementada en el backend (NestJS) como un servicio de cálculo de precios desacoplado, lo que permite actualizar las reglas de tarificación sin modificar la lógica de registro de pedidos.</w:t>
       </w:r>
     </w:p>
     <w:p>
@@ -16940,7 +16851,6 @@
           <w:rFonts w:ascii="Times New Roman" w:hAnsi="Times New Roman"/>
           <w:sz w:val="24"/>
         </w:rPr>
-        <w:t>Implementación del servicio de cálculo de precios dinámico.</w:t>
       </w:r>
     </w:p>
     <w:p>
@@ -16988,7 +16898,6 @@
           <w:rFonts w:ascii="Times New Roman" w:hAnsi="Times New Roman"/>
           <w:sz w:val="24"/>
         </w:rPr>
-        <w:t>Diseño e implementación de la API de compras: órdenes de compra y recepción de mercadería.</w:t>
       </w:r>
     </w:p>
     <w:p>
@@ -17000,7 +16909,6 @@
           <w:rFonts w:ascii="Times New Roman" w:hAnsi="Times New Roman"/>
           <w:sz w:val="24"/>
         </w:rPr>
-        <w:t>Implementación del trigger automático de actualización de inventario de materia prima al registrar una recepción de OC.</w:t>
       </w:r>
     </w:p>
     <w:p>
@@ -17012,7 +16920,6 @@
           <w:rFonts w:ascii="Times New Roman" w:hAnsi="Times New Roman"/>
           <w:sz w:val="24"/>
         </w:rPr>
-        <w:t>Desarrollo de las interfaces de frontend: formulario de OC, registro de recepción, historial de compras.</w:t>
       </w:r>
     </w:p>
     <w:p>
@@ -17024,7 +16931,6 @@
           <w:rFonts w:ascii="Times New Roman" w:hAnsi="Times New Roman"/>
           <w:sz w:val="24"/>
         </w:rPr>
-        <w:t>Pruebas funcionales con el área de ventas y compras.</w:t>
       </w:r>
     </w:p>
     <w:p>
@@ -17054,7 +16960,6 @@
           <w:color w:val="000000"/>
           <w:sz w:val="24"/>
         </w:rPr>
-        <w:t>Al finalizar el Sprint 2, el sistema permitía la gestión completa del flujo de pedidos desde la creación hasta la confirmación, y el ciclo de compras desde la emisión de la OC hasta la recepción de mercadería con actualización automática del inventario. La sesión de revisión del sprint contó con la participación del Encargado de Ventas, quien validó la corrección del cálculo de precios comparando los resultados del sistema contra los registros manuales históricos.</w:t>
       </w:r>
     </w:p>
     <w:p>
@@ -17111,7 +17016,7 @@
           <w:color w:val="000000"/>
           <w:sz w:val="26"/>
         </w:rPr>
-        <w:t>3.3 Sprint 3 — Módulo de Producción e Inventario Dual</w:t>
+        <w:t>3.3 Sprint 3 — Módulo de Despacho y Distribución</w:t>
       </w:r>
     </w:p>
     <w:p>
@@ -17141,7 +17046,7 @@
           <w:color w:val="000000"/>
           <w:sz w:val="24"/>
         </w:rPr>
-        <w:t>El Sprint 3 implementó el núcleo operativo de la planta: el módulo de producción con trazabilidad completa de lotes y el módulo de inventario dual con movimientos automáticos.</w:t>
+        <w:t>El Sprint 3 implementó el módulo de despacho y distribución: armado de hojas de carga por ruta, asignación de vehículos y choferes, y registro de entregas en campo.</w:t>
       </w:r>
     </w:p>
     <w:p>
@@ -17156,7 +17061,6 @@
           <w:color w:val="000000"/>
           <w:sz w:val="24"/>
         </w:rPr>
-        <w:t>3.3.2 Lógica de Negocio: Cálculo de Rendimiento y Merma</w:t>
       </w:r>
     </w:p>
     <w:p>
@@ -17171,7 +17075,6 @@
           <w:color w:val="000000"/>
           <w:sz w:val="24"/>
         </w:rPr>
-        <w:t>Al registrar un lote de producción, el sistema calcula automáticamente los indicadores de eficiencia productiva:</w:t>
       </w:r>
     </w:p>
     <w:p>
@@ -17185,13 +17088,6 @@
           <w:color w:val="1E1E1E"/>
           <w:sz w:val="16"/>
         </w:rPr>
-        <w:t>Rendimiento (%) = (Kg Producto Terminado Obtenido / Kg Materia Prima Utilizada) × 100</w:t>
-        <w:br/>
-        <w:t>Merma (kg) = Kg Materia Prima Utilizada − Kg Producto Terminado Obtenido</w:t>
-        <w:br/>
-        <w:t>Merma (%) = 100 − Rendimiento (%)</w:t>
-        <w:br/>
-        <w:t>Costo Real por Kg PT = (Costo MP Utilizada + Costos Fijos del Lote) / Kg PT Obtenidos</w:t>
       </w:r>
     </w:p>
     <w:p>
@@ -17206,7 +17102,6 @@
           <w:color w:val="000000"/>
           <w:sz w:val="24"/>
         </w:rPr>
-        <w:t>Estos indicadores son críticos para la gestión del negocio, ya que permiten identificar variaciones en la calidad de la materia prima recibida (papa con mayor proporción de cáscara o partes no aprovechables) y su impacto en el costo de producción.</w:t>
       </w:r>
     </w:p>
     <w:p>
@@ -17233,7 +17128,6 @@
           <w:rFonts w:ascii="Times New Roman" w:hAnsi="Times New Roman"/>
           <w:sz w:val="24"/>
         </w:rPr>
-        <w:t>Diseño e implementación de la API de programación de producción vinculada a pedidos.</w:t>
       </w:r>
     </w:p>
     <w:p>
@@ -17245,7 +17139,6 @@
           <w:rFonts w:ascii="Times New Roman" w:hAnsi="Times New Roman"/>
           <w:sz w:val="24"/>
         </w:rPr>
-        <w:t>Implementación del registro de lotes de producción con el servicio de cálculo de indicadores.</w:t>
       </w:r>
     </w:p>
     <w:p>
@@ -17257,7 +17150,6 @@
           <w:rFonts w:ascii="Times New Roman" w:hAnsi="Times New Roman"/>
           <w:sz w:val="24"/>
         </w:rPr>
-        <w:t>Implementación de los triggers automáticos de movimientos de inventario al cerrar un lote.</w:t>
       </w:r>
     </w:p>
     <w:p>
@@ -17269,7 +17161,6 @@
           <w:rFonts w:ascii="Times New Roman" w:hAnsi="Times New Roman"/>
           <w:sz w:val="24"/>
         </w:rPr>
-        <w:t>Desarrollo del módulo de inventario dual: kardex de materia prima y producto terminado.</w:t>
       </w:r>
     </w:p>
     <w:p>
@@ -17281,7 +17172,6 @@
           <w:rFonts w:ascii="Times New Roman" w:hAnsi="Times New Roman"/>
           <w:sz w:val="24"/>
         </w:rPr>
-        <w:t>Implementación del sistema de alertas de stock mínimo.</w:t>
       </w:r>
     </w:p>
     <w:p>
@@ -17293,7 +17183,6 @@
           <w:rFonts w:ascii="Times New Roman" w:hAnsi="Times New Roman"/>
           <w:sz w:val="24"/>
         </w:rPr>
-        <w:t>Implementación del registro de ajustes de inventario con trazabilidad.</w:t>
       </w:r>
     </w:p>
     <w:p>
@@ -17305,7 +17194,6 @@
           <w:rFonts w:ascii="Times New Roman" w:hAnsi="Times New Roman"/>
           <w:sz w:val="24"/>
         </w:rPr>
-        <w:t>Desarrollo de las interfaces de producción: programación diaria, registro de lotes, indicadores.</w:t>
       </w:r>
     </w:p>
     <w:p>
@@ -17317,7 +17205,6 @@
           <w:rFonts w:ascii="Times New Roman" w:hAnsi="Times New Roman"/>
           <w:sz w:val="24"/>
         </w:rPr>
-        <w:t>Desarrollo de las interfaces de inventario: stock actual, kardex, alertas.</w:t>
       </w:r>
     </w:p>
     <w:p>
@@ -17329,7 +17216,6 @@
           <w:rFonts w:ascii="Times New Roman" w:hAnsi="Times New Roman"/>
           <w:sz w:val="24"/>
         </w:rPr>
-        <w:t>Pruebas funcionales con el Jefe de Producción y el Jefe de Almacén.</w:t>
       </w:r>
     </w:p>
     <w:p>
@@ -17386,7 +17272,7 @@
           <w:color w:val="000000"/>
           <w:sz w:val="26"/>
         </w:rPr>
-        <w:t>3.4 Sprint 4 — Módulo de Despacho y Distribución</w:t>
+        <w:t>3.4 Sprint 4 — Dashboard, Reportes y Auditoría</w:t>
       </w:r>
     </w:p>
     <w:p>
@@ -17416,7 +17302,7 @@
           <w:color w:val="000000"/>
           <w:sz w:val="24"/>
         </w:rPr>
-        <w:t>El Sprint 4 implementó el módulo de mayor complejidad operativa: la gestión integral del despacho desde el armado de carga hasta el registro de entregas y cobros en campo.</w:t>
+        <w:t>El Sprint 4 implementó el dashboard ejecutivo de KPIs, los reportes exportables a Excel y el log de auditoría.</w:t>
       </w:r>
     </w:p>
     <w:p>
@@ -17494,7 +17380,6 @@
           <w:rFonts w:ascii="Times New Roman" w:hAnsi="Times New Roman"/>
           <w:sz w:val="24"/>
         </w:rPr>
-        <w:t>Genera la Guía de Remisión Electrónica (GRE) con los datos del traslado.</w:t>
       </w:r>
     </w:p>
     <w:p>
@@ -17518,7 +17403,7 @@
           <w:rFonts w:ascii="Times New Roman" w:hAnsi="Times New Roman"/>
           <w:sz w:val="24"/>
         </w:rPr>
-        <w:t>El chofer registra las entregas desde su smartphone: confirmación de entrega o novedad con descripción.</w:t>
+        <w:t>El chofer registra las entregas desde su smartphone: confirmación de entrega exitosa o registro de novedad con observación.</w:t>
       </w:r>
     </w:p>
     <w:p>
@@ -17530,7 +17415,7 @@
           <w:rFonts w:ascii="Times New Roman" w:hAnsi="Times New Roman"/>
           <w:sz w:val="24"/>
         </w:rPr>
-        <w:t>El sistema actualiza el estado de cada pedido a "Entregado" o "Con Novedad".</w:t>
+        <w:t>El sistema actualiza el estado de cada pedido a DELIVERED o ISSUE.</w:t>
       </w:r>
     </w:p>
     <w:p>
@@ -17542,7 +17427,7 @@
           <w:rFonts w:ascii="Times New Roman" w:hAnsi="Times New Roman"/>
           <w:sz w:val="24"/>
         </w:rPr>
-        <w:t>Al finalizar la ruta, el sistema consolida los cobros realizados por chofer para el cierre de caja.</w:t>
+        <w:t>Al finalizar la ruta, el sistema la hoja de carga pasa automáticamente a estado COMPLETADO.</w:t>
       </w:r>
     </w:p>
     <w:p>
@@ -17593,7 +17478,6 @@
           <w:rFonts w:ascii="Times New Roman" w:hAnsi="Times New Roman"/>
           <w:sz w:val="24"/>
         </w:rPr>
-        <w:t>Implementación del generador de GRE en el formato estructurado requerido.</w:t>
       </w:r>
     </w:p>
     <w:p>
@@ -17641,7 +17525,6 @@
           <w:rFonts w:ascii="Times New Roman" w:hAnsi="Times New Roman"/>
           <w:sz w:val="24"/>
         </w:rPr>
-        <w:t>Implementación del consolidado de cobros del día.</w:t>
       </w:r>
     </w:p>
     <w:p>
@@ -17731,7 +17614,6 @@
           <w:color w:val="000000"/>
           <w:sz w:val="26"/>
         </w:rPr>
-        <w:t>3.5 Sprint 5 — Dashboard, Reportes y Auditoría</w:t>
       </w:r>
     </w:p>
     <w:p>
@@ -17800,7 +17682,7 @@
           <w:rFonts w:ascii="Times New Roman" w:hAnsi="Times New Roman"/>
           <w:sz w:val="24"/>
         </w:rPr>
-        <w:t>Implementación de los endpoints de reportes agregados (pedidos, compras, producción, despacho).</w:t>
+        <w:t>Implementación de los endpoints de reportes agregados (pedidos y despacho).</w:t>
       </w:r>
     </w:p>
     <w:p>
@@ -17812,7 +17694,7 @@
           <w:rFonts w:ascii="Times New Roman" w:hAnsi="Times New Roman"/>
           <w:sz w:val="24"/>
         </w:rPr>
-        <w:t>Implementación de la exportación a Excel (XLSX) y PDF.</w:t>
+        <w:t>Implementación de la exportación a Excel (XLSX).</w:t>
       </w:r>
     </w:p>
     <w:p>
@@ -17976,7 +17858,7 @@
           <w:rFonts w:ascii="Times New Roman" w:hAnsi="Times New Roman"/>
           <w:sz w:val="24"/>
         </w:rPr>
-        <w:t>Las 45 pollerías clientes ahora tienen sus pedidos registrados digitalmente con cálculo automático de precios, eliminando por completo el cuaderno de pedidos manual y los errores de cálculo. El tiempo promedio de registro de un pedido se redujo de 8 a 3 minutos.</w:t>
+        <w:t>Las 45 pollerías clientes ahora tienen sus pedidos registrados digitalmente eliminando por completo el cuaderno de pedidos manual. El tiempo promedio de registro de un pedido se redujo de 8 a 3 minutos.</w:t>
       </w:r>
     </w:p>
     <w:p>
@@ -17989,14 +17871,12 @@
           <w:b/>
           <w:sz w:val="24"/>
         </w:rPr>
-        <w:t xml:space="preserve">Trazabilidad de la cadena de producción: </w:t>
       </w:r>
       <w:r>
         <w:rPr>
           <w:rFonts w:ascii="Times New Roman" w:hAnsi="Times New Roman"/>
           <w:sz w:val="24"/>
         </w:rPr>
-        <w:t>Cada lote de producción queda registrado con sus insumos, productos obtenidos, rendimiento y merma. El Jefe de Producción puede comparar el rendimiento entre lotes y proveedores, identificando variaciones de calidad en la materia prima.</w:t>
       </w:r>
     </w:p>
     <w:p>
@@ -18009,14 +17889,12 @@
           <w:b/>
           <w:sz w:val="24"/>
         </w:rPr>
-        <w:t xml:space="preserve">Control de inventario en tiempo real: </w:t>
       </w:r>
       <w:r>
         <w:rPr>
           <w:rFonts w:ascii="Times New Roman" w:hAnsi="Times New Roman"/>
           <w:sz w:val="24"/>
         </w:rPr>
-        <w:t>Ambos inventarios (materia prima y producto terminado) reflejan el estado actual sin necesidad de conteos manuales cotidianos. El sistema generó 47 alertas de stock mínimo en el primer mes de operación, permitiendo gestionar proactivamente el abastecimiento.</w:t>
       </w:r>
     </w:p>
     <w:p>
@@ -19373,7 +19251,6 @@
           <w:rFonts w:ascii="Times New Roman" w:hAnsi="Times New Roman"/>
           <w:sz w:val="24"/>
         </w:rPr>
-        <w:t>La implementación del cálculo automático de precios dinámico en el módulo de pedidos —considerando el precio base del SKU, la tarifa por ruta según ubigeo y el factor de tipo de cliente— eliminó los errores de cotización que anteriormente generaban pérdidas económicas y conflictos comerciales con los clientes.</w:t>
       </w:r>
     </w:p>
     <w:p>
@@ -19385,7 +19262,6 @@
           <w:rFonts w:ascii="Times New Roman" w:hAnsi="Times New Roman"/>
           <w:sz w:val="24"/>
         </w:rPr>
-        <w:t>El módulo de producción con cálculo automático de rendimiento y merma por lote proporcionó a la empresa, por primera vez, datos objetivos sobre la eficiencia de su proceso productivo, revelando variaciones de rendimiento de hasta 12 puntos porcentuales entre lotes de distintos proveedores de materia prima, información de alto valor para las decisiones de compra.</w:t>
       </w:r>
     </w:p>
     <w:p>
@@ -19397,7 +19273,6 @@
           <w:rFonts w:ascii="Times New Roman" w:hAnsi="Times New Roman"/>
           <w:sz w:val="24"/>
         </w:rPr>
-        <w:t>El control de inventario dual con movimientos automáticos vinculados a las transacciones de compra, producción y despacho eliminó la necesidad de registros manuales paralelos, garantizando la consistencia del stock en tiempo real y reduciendo el tiempo dedicado al control de almacén en aproximadamente un 60%.</w:t>
       </w:r>
     </w:p>
     <w:p>
@@ -19453,7 +19328,7 @@
           <w:rFonts w:ascii="Times New Roman" w:hAnsi="Times New Roman"/>
           <w:sz w:val="24"/>
         </w:rPr>
-        <w:t>Se recomienda a La Cosecha S.A.C. mantener actualizado el catálogo de rutas y tarifas de distribución al menos trimestralmente, para garantizar que el cálculo automático de precios refleje siempre la realidad operativa y comercial de la empresa.</w:t>
+        <w:t>Se recomienda a La Cosecha S.A.C. mantener actualizado el catálogo de rutas y clientes para garantizar la correcta planificación de despachos.</w:t>
       </w:r>
     </w:p>
     <w:p>
@@ -19477,7 +19352,7 @@
           <w:rFonts w:ascii="Times New Roman" w:hAnsi="Times New Roman"/>
           <w:sz w:val="24"/>
         </w:rPr>
-        <w:t>Se recomienda revisar los niveles mínimos de stock configurados en el módulo de inventario después de los primeros tres meses de operación, ajustándolos con base en los datos reales de consumo registrados por el sistema.</w:t>
+        <w:t>Se recomienda considerar en el mediano plazo la implementación de módulos complementarios de compras, producción e inventario para cubrir el ciclo operativo completo de la empresa.</w:t>
       </w:r>
     </w:p>
     <w:p>

</xml_diff>